<commit_message>
feat(curriculum): audit items 2-24 — units pacing, hub audiences, fluency streak, family checks and languages, readiness, sitemap, standards, spiral review, shuffled choices, unified progress
Squash of the ten audit workstreams (units, hub, fluency, content 1-9,
engine, readiness, consolidate, seo) onto origin/main.

Claude-Session: https://claude.ai/code/session_01MGbm1CWkPGhuWwuWBs9HqE
</commit_message>
<xml_diff>
--- a/lessons/2-11/readiness/practice.docx
+++ b/lessons/2-11/readiness/practice.docx
@@ -29,7 +29,7 @@
           <w:sz w:val="20"/>
           <w:szCs w:val="20"/>
         </w:rPr>
-        <w:t xml:space="preserve">Readiness practice for Lesson 1-5  ·  Builds toward 6.NS.3</w:t>
+        <w:t xml:space="preserve">Readiness practice for Lesson 2-11 (Unit 2 · Lesson 11)  ·  Builds toward 6.NOS.3</w:t>
       </w:r>
     </w:p>
     <w:p>
@@ -432,7 +432,7 @@
           <w:sz w:val="20"/>
           <w:szCs w:val="20"/>
         </w:rPr>
-        <w:t xml:space="preserve">When you've finished, open Lesson 1-5 and dive in!</w:t>
+        <w:t xml:space="preserve">When you've finished, open Lesson 2-11 and dive in!</w:t>
       </w:r>
     </w:p>
     <w:p>

</xml_diff>